<commit_message>
Data: db-schema gemigreerd naar nieuwe kolommen
</commit_message>
<xml_diff>
--- a/Verantwoordingsdocument Beleidsmonitor.docx
+++ b/Verantwoordingsdocument Beleidsmonitor.docx
@@ -1521,7 +1521,1834 @@
         <w:rPr>
           <w:color w:val="000000"/>
         </w:rPr>
-        <w:t>9. Verantwoording gebruik generatieve AI</w:t>
+        <w:t>9. Validatie van de classificatie</w:t>
+      </w:r>
+    </w:p>
+    <w:p>
+      <w:r>
+        <w:t>De classificatie is op twee manieren getoetst: (a) een interne-consistentietoets die nagaat of het indicatorenkader uniform en generiek wordt toegepast, en (b) een zelf-gecodeerde steekproef die de accuratesse benadert. Beide kennen een belangrijke beperking, die expliciet wordt benoemd.</w:t>
+      </w:r>
+    </w:p>
+    <w:p>
+      <w:pPr>
+        <w:pStyle w:val="Heading2"/>
+      </w:pPr>
+      <w:r>
+        <w:rPr>
+          <w:color w:val="000000"/>
+        </w:rPr>
+        <w:t>9.1 Interne consistentie (zelfde documenttype, zelfde oordeel)</w:t>
+      </w:r>
+    </w:p>
+    <w:p>
+      <w:r>
+        <w:t>Voor terugkerende documenttypen is nagegaan of de tool ze in verschillende gemeenten (casus- en niet-casusgemeenten) hetzelfde classificeert.</w:t>
+      </w:r>
+    </w:p>
+    <w:p>
+      <w:r>
+        <w:t>Voorbeeld 1 — netcongestie-raadsstukken (indicator 4):</w:t>
+      </w:r>
+    </w:p>
+    <w:tbl>
+      <w:tblPr>
+        <w:tblStyle w:val="TableGrid"/>
+        <w:tblW w:type="auto" w:w="0"/>
+        <w:tblLook w:firstColumn="1" w:firstRow="1" w:lastColumn="0" w:lastRow="0" w:noHBand="0" w:noVBand="1" w:val="04A0"/>
+      </w:tblPr>
+      <w:tblGrid>
+        <w:gridCol w:w="2268"/>
+        <w:gridCol w:w="2268"/>
+        <w:gridCol w:w="2268"/>
+        <w:gridCol w:w="2268"/>
+      </w:tblGrid>
+      <w:tr>
+        <w:tc>
+          <w:tcPr>
+            <w:tcW w:type="dxa" w:w="1814"/>
+            <w:shd w:val="clear" w:fill="DDDDDD"/>
+          </w:tcPr>
+          <w:p>
+            <w:r/>
+            <w:r>
+              <w:rPr>
+                <w:b/>
+                <w:sz w:val="20"/>
+              </w:rPr>
+              <w:t>Gemeente</w:t>
+            </w:r>
+          </w:p>
+        </w:tc>
+        <w:tc>
+          <w:tcPr>
+            <w:tcW w:type="dxa" w:w="2438"/>
+            <w:shd w:val="clear" w:fill="DDDDDD"/>
+          </w:tcPr>
+          <w:p>
+            <w:r/>
+            <w:r>
+              <w:rPr>
+                <w:b/>
+                <w:sz w:val="20"/>
+              </w:rPr>
+              <w:t>Document</w:t>
+            </w:r>
+          </w:p>
+        </w:tc>
+        <w:tc>
+          <w:tcPr>
+            <w:tcW w:type="dxa" w:w="3685"/>
+            <w:shd w:val="clear" w:fill="DDDDDD"/>
+          </w:tcPr>
+          <w:p>
+            <w:r/>
+            <w:r>
+              <w:rPr>
+                <w:b/>
+                <w:sz w:val="20"/>
+              </w:rPr>
+              <w:t>Inhoud</w:t>
+            </w:r>
+          </w:p>
+        </w:tc>
+        <w:tc>
+          <w:tcPr>
+            <w:tcW w:type="dxa" w:w="1134"/>
+            <w:shd w:val="clear" w:fill="DDDDDD"/>
+          </w:tcPr>
+          <w:p>
+            <w:r/>
+            <w:r>
+              <w:rPr>
+                <w:b/>
+                <w:sz w:val="20"/>
+              </w:rPr>
+              <w:t>Oordeel</w:t>
+            </w:r>
+          </w:p>
+        </w:tc>
+      </w:tr>
+      <w:tr>
+        <w:tc>
+          <w:tcPr>
+            <w:tcW w:type="dxa" w:w="1814"/>
+          </w:tcPr>
+          <w:p>
+            <w:r/>
+            <w:r>
+              <w:rPr>
+                <w:sz w:val="20"/>
+              </w:rPr>
+              <w:t>'s-Hertogenbosch</w:t>
+            </w:r>
+          </w:p>
+        </w:tc>
+        <w:tc>
+          <w:tcPr>
+            <w:tcW w:type="dxa" w:w="2438"/>
+          </w:tcPr>
+          <w:p>
+            <w:r/>
+            <w:r>
+              <w:rPr>
+                <w:sz w:val="20"/>
+              </w:rPr>
+              <w:t>Update netcongestie</w:t>
+            </w:r>
+          </w:p>
+        </w:tc>
+        <w:tc>
+          <w:tcPr>
+            <w:tcW w:type="dxa" w:w="3685"/>
+          </w:tcPr>
+          <w:p>
+            <w:r/>
+            <w:r>
+              <w:rPr>
+                <w:sz w:val="20"/>
+              </w:rPr>
+              <w:t>wachtlijsten 5-10 jaar voor nieuwe aansluitingen</w:t>
+            </w:r>
+          </w:p>
+        </w:tc>
+        <w:tc>
+          <w:tcPr>
+            <w:tcW w:type="dxa" w:w="1134"/>
+          </w:tcPr>
+          <w:p>
+            <w:r/>
+            <w:r>
+              <w:rPr>
+                <w:sz w:val="20"/>
+              </w:rPr>
+              <w:t>ind. 4 / risico</w:t>
+            </w:r>
+          </w:p>
+        </w:tc>
+      </w:tr>
+      <w:tr>
+        <w:tc>
+          <w:tcPr>
+            <w:tcW w:type="dxa" w:w="1814"/>
+          </w:tcPr>
+          <w:p>
+            <w:r/>
+            <w:r>
+              <w:rPr>
+                <w:sz w:val="20"/>
+              </w:rPr>
+              <w:t>Den Haag</w:t>
+            </w:r>
+          </w:p>
+        </w:tc>
+        <w:tc>
+          <w:tcPr>
+            <w:tcW w:type="dxa" w:w="2438"/>
+          </w:tcPr>
+          <w:p>
+            <w:r/>
+            <w:r>
+              <w:rPr>
+                <w:sz w:val="20"/>
+              </w:rPr>
+              <w:t>Herijking impactanalyse netcongestie</w:t>
+            </w:r>
+          </w:p>
+        </w:tc>
+        <w:tc>
+          <w:tcPr>
+            <w:tcW w:type="dxa" w:w="3685"/>
+          </w:tcPr>
+          <w:p>
+            <w:r/>
+            <w:r>
+              <w:rPr>
+                <w:sz w:val="20"/>
+              </w:rPr>
+              <w:t>netcongestie op alle netniveaus; projecten op wachtlijst</w:t>
+            </w:r>
+          </w:p>
+        </w:tc>
+        <w:tc>
+          <w:tcPr>
+            <w:tcW w:type="dxa" w:w="1134"/>
+          </w:tcPr>
+          <w:p>
+            <w:r/>
+            <w:r>
+              <w:rPr>
+                <w:sz w:val="20"/>
+              </w:rPr>
+              <w:t>ind. 4 / risico</w:t>
+            </w:r>
+          </w:p>
+        </w:tc>
+      </w:tr>
+      <w:tr>
+        <w:tc>
+          <w:tcPr>
+            <w:tcW w:type="dxa" w:w="1814"/>
+          </w:tcPr>
+          <w:p>
+            <w:r/>
+            <w:r>
+              <w:rPr>
+                <w:sz w:val="20"/>
+              </w:rPr>
+              <w:t>Helmond</w:t>
+            </w:r>
+          </w:p>
+        </w:tc>
+        <w:tc>
+          <w:tcPr>
+            <w:tcW w:type="dxa" w:w="2438"/>
+          </w:tcPr>
+          <w:p>
+            <w:r/>
+            <w:r>
+              <w:rPr>
+                <w:sz w:val="20"/>
+              </w:rPr>
+              <w:t>RIB 153 Update netcongestie</w:t>
+            </w:r>
+          </w:p>
+        </w:tc>
+        <w:tc>
+          <w:tcPr>
+            <w:tcW w:type="dxa" w:w="3685"/>
+          </w:tcPr>
+          <w:p>
+            <w:r/>
+            <w:r>
+              <w:rPr>
+                <w:sz w:val="20"/>
+              </w:rPr>
+              <w:t>geen aansluitingen voor grootverbruikers tot minstens 2035</w:t>
+            </w:r>
+          </w:p>
+        </w:tc>
+        <w:tc>
+          <w:tcPr>
+            <w:tcW w:type="dxa" w:w="1134"/>
+          </w:tcPr>
+          <w:p>
+            <w:r/>
+            <w:r>
+              <w:rPr>
+                <w:sz w:val="20"/>
+              </w:rPr>
+              <w:t>ind. 4 / risico</w:t>
+            </w:r>
+          </w:p>
+        </w:tc>
+      </w:tr>
+      <w:tr>
+        <w:tc>
+          <w:tcPr>
+            <w:tcW w:type="dxa" w:w="1814"/>
+          </w:tcPr>
+          <w:p>
+            <w:r/>
+            <w:r>
+              <w:rPr>
+                <w:sz w:val="20"/>
+              </w:rPr>
+              <w:t>Oss</w:t>
+            </w:r>
+          </w:p>
+        </w:tc>
+        <w:tc>
+          <w:tcPr>
+            <w:tcW w:type="dxa" w:w="2438"/>
+          </w:tcPr>
+          <w:p>
+            <w:r/>
+            <w:r>
+              <w:rPr>
+                <w:sz w:val="20"/>
+              </w:rPr>
+              <w:t>Raadsinformatiebrief netcongestie</w:t>
+            </w:r>
+          </w:p>
+        </w:tc>
+        <w:tc>
+          <w:tcPr>
+            <w:tcW w:type="dxa" w:w="3685"/>
+          </w:tcPr>
+          <w:p>
+            <w:r/>
+            <w:r>
+              <w:rPr>
+                <w:sz w:val="20"/>
+              </w:rPr>
+              <w:t>Enexis stopt per 1-7-2026 met nieuwe aansluitingen</w:t>
+            </w:r>
+          </w:p>
+        </w:tc>
+        <w:tc>
+          <w:tcPr>
+            <w:tcW w:type="dxa" w:w="1134"/>
+          </w:tcPr>
+          <w:p>
+            <w:r/>
+            <w:r>
+              <w:rPr>
+                <w:sz w:val="20"/>
+              </w:rPr>
+              <w:t>ind. 4 / risico</w:t>
+            </w:r>
+          </w:p>
+        </w:tc>
+      </w:tr>
+      <w:tr>
+        <w:tc>
+          <w:tcPr>
+            <w:tcW w:type="dxa" w:w="1814"/>
+          </w:tcPr>
+          <w:p>
+            <w:r/>
+            <w:r>
+              <w:rPr>
+                <w:sz w:val="20"/>
+              </w:rPr>
+              <w:t>Gouda</w:t>
+            </w:r>
+          </w:p>
+        </w:tc>
+        <w:tc>
+          <w:tcPr>
+            <w:tcW w:type="dxa" w:w="2438"/>
+          </w:tcPr>
+          <w:p>
+            <w:r/>
+            <w:r>
+              <w:rPr>
+                <w:sz w:val="20"/>
+              </w:rPr>
+              <w:t>Memo raad netcongestie</w:t>
+            </w:r>
+          </w:p>
+        </w:tc>
+        <w:tc>
+          <w:tcPr>
+            <w:tcW w:type="dxa" w:w="3685"/>
+          </w:tcPr>
+          <w:p>
+            <w:r/>
+            <w:r>
+              <w:rPr>
+                <w:sz w:val="20"/>
+              </w:rPr>
+              <w:t>stop nieuwe grootverbruik-aanvragen bedrijventerrein Gouwespoor</w:t>
+            </w:r>
+          </w:p>
+        </w:tc>
+        <w:tc>
+          <w:tcPr>
+            <w:tcW w:type="dxa" w:w="1134"/>
+          </w:tcPr>
+          <w:p>
+            <w:r/>
+            <w:r>
+              <w:rPr>
+                <w:sz w:val="20"/>
+              </w:rPr>
+              <w:t>ind. 4 / risico</w:t>
+            </w:r>
+          </w:p>
+        </w:tc>
+      </w:tr>
+      <w:tr>
+        <w:tc>
+          <w:tcPr>
+            <w:tcW w:type="dxa" w:w="1814"/>
+          </w:tcPr>
+          <w:p>
+            <w:r/>
+            <w:r>
+              <w:rPr>
+                <w:sz w:val="20"/>
+              </w:rPr>
+              <w:t>Flevoland</w:t>
+            </w:r>
+          </w:p>
+        </w:tc>
+        <w:tc>
+          <w:tcPr>
+            <w:tcW w:type="dxa" w:w="2438"/>
+          </w:tcPr>
+          <w:p>
+            <w:r/>
+            <w:r>
+              <w:rPr>
+                <w:sz w:val="20"/>
+              </w:rPr>
+              <w:t>Nadere regels Oplossingen voor bedrijven</w:t>
+            </w:r>
+          </w:p>
+        </w:tc>
+        <w:tc>
+          <w:tcPr>
+            <w:tcW w:type="dxa" w:w="3685"/>
+          </w:tcPr>
+          <w:p>
+            <w:r/>
+            <w:r>
+              <w:rPr>
+                <w:sz w:val="20"/>
+              </w:rPr>
+              <w:t>provincie subsidieert oplossingen voor netcongestie</w:t>
+            </w:r>
+          </w:p>
+        </w:tc>
+        <w:tc>
+          <w:tcPr>
+            <w:tcW w:type="dxa" w:w="1134"/>
+          </w:tcPr>
+          <w:p>
+            <w:r/>
+            <w:r>
+              <w:rPr>
+                <w:sz w:val="20"/>
+              </w:rPr>
+              <w:t>ind. 4 / kans</w:t>
+            </w:r>
+          </w:p>
+        </w:tc>
+      </w:tr>
+    </w:tbl>
+    <w:p>
+      <w:r>
+        <w:t>Zelfde type, consistent indicator 4 / risico. Flevoland wijkt af (kans) omdat het een oplossing/subsidie biedt in plaats van het probleem te melden: het verschil is inhoudsgedreven, niet gemeente-afhankelijk.</w:t>
+      </w:r>
+    </w:p>
+    <w:p>
+      <w:r>
+        <w:t>Voorbeeld 2 — 'voornemen tot uitgifte/verkoop van een perceel' (indicator 2):</w:t>
+      </w:r>
+    </w:p>
+    <w:tbl>
+      <w:tblPr>
+        <w:tblStyle w:val="TableGrid"/>
+        <w:tblW w:type="auto" w:w="0"/>
+        <w:tblLook w:firstColumn="1" w:firstRow="1" w:lastColumn="0" w:lastRow="0" w:noHBand="0" w:noVBand="1" w:val="04A0"/>
+      </w:tblPr>
+      <w:tblGrid>
+        <w:gridCol w:w="2268"/>
+        <w:gridCol w:w="2268"/>
+        <w:gridCol w:w="2268"/>
+        <w:gridCol w:w="2268"/>
+      </w:tblGrid>
+      <w:tr>
+        <w:tc>
+          <w:tcPr>
+            <w:tcW w:type="dxa" w:w="1814"/>
+            <w:shd w:val="clear" w:fill="DDDDDD"/>
+          </w:tcPr>
+          <w:p>
+            <w:r/>
+            <w:r>
+              <w:rPr>
+                <w:b/>
+                <w:sz w:val="20"/>
+              </w:rPr>
+              <w:t>Gemeente</w:t>
+            </w:r>
+          </w:p>
+        </w:tc>
+        <w:tc>
+          <w:tcPr>
+            <w:tcW w:type="dxa" w:w="2438"/>
+            <w:shd w:val="clear" w:fill="DDDDDD"/>
+          </w:tcPr>
+          <w:p>
+            <w:r/>
+            <w:r>
+              <w:rPr>
+                <w:b/>
+                <w:sz w:val="20"/>
+              </w:rPr>
+              <w:t>Document</w:t>
+            </w:r>
+          </w:p>
+        </w:tc>
+        <w:tc>
+          <w:tcPr>
+            <w:tcW w:type="dxa" w:w="3685"/>
+            <w:shd w:val="clear" w:fill="DDDDDD"/>
+          </w:tcPr>
+          <w:p>
+            <w:r/>
+            <w:r>
+              <w:rPr>
+                <w:b/>
+                <w:sz w:val="20"/>
+              </w:rPr>
+              <w:t>Inhoud</w:t>
+            </w:r>
+          </w:p>
+        </w:tc>
+        <w:tc>
+          <w:tcPr>
+            <w:tcW w:type="dxa" w:w="1134"/>
+            <w:shd w:val="clear" w:fill="DDDDDD"/>
+          </w:tcPr>
+          <w:p>
+            <w:r/>
+            <w:r>
+              <w:rPr>
+                <w:b/>
+                <w:sz w:val="20"/>
+              </w:rPr>
+              <w:t>Oordeel</w:t>
+            </w:r>
+          </w:p>
+        </w:tc>
+      </w:tr>
+      <w:tr>
+        <w:tc>
+          <w:tcPr>
+            <w:tcW w:type="dxa" w:w="1814"/>
+          </w:tcPr>
+          <w:p>
+            <w:r/>
+            <w:r>
+              <w:rPr>
+                <w:sz w:val="20"/>
+              </w:rPr>
+              <w:t>Helmond</w:t>
+            </w:r>
+          </w:p>
+        </w:tc>
+        <w:tc>
+          <w:tcPr>
+            <w:tcW w:type="dxa" w:w="2438"/>
+          </w:tcPr>
+          <w:p>
+            <w:r/>
+            <w:r>
+              <w:rPr>
+                <w:sz w:val="20"/>
+              </w:rPr>
+              <w:t>Voornemen tot verkoop perceel</w:t>
+            </w:r>
+          </w:p>
+        </w:tc>
+        <w:tc>
+          <w:tcPr>
+            <w:tcW w:type="dxa" w:w="3685"/>
+          </w:tcPr>
+          <w:p>
+            <w:r/>
+            <w:r>
+              <w:rPr>
+                <w:sz w:val="20"/>
+              </w:rPr>
+              <w:t>1,55 ha voor bedrijfsuitbreiding</w:t>
+            </w:r>
+          </w:p>
+        </w:tc>
+        <w:tc>
+          <w:tcPr>
+            <w:tcW w:type="dxa" w:w="1134"/>
+          </w:tcPr>
+          <w:p>
+            <w:r/>
+            <w:r>
+              <w:rPr>
+                <w:sz w:val="20"/>
+              </w:rPr>
+              <w:t>ind. 2 / kans</w:t>
+            </w:r>
+          </w:p>
+        </w:tc>
+      </w:tr>
+      <w:tr>
+        <w:tc>
+          <w:tcPr>
+            <w:tcW w:type="dxa" w:w="1814"/>
+          </w:tcPr>
+          <w:p>
+            <w:r/>
+            <w:r>
+              <w:rPr>
+                <w:sz w:val="20"/>
+              </w:rPr>
+              <w:t>Nieuwegein</w:t>
+            </w:r>
+          </w:p>
+        </w:tc>
+        <w:tc>
+          <w:tcPr>
+            <w:tcW w:type="dxa" w:w="2438"/>
+          </w:tcPr>
+          <w:p>
+            <w:r/>
+            <w:r>
+              <w:rPr>
+                <w:sz w:val="20"/>
+              </w:rPr>
+              <w:t>Verkoop kavel 19, Het Klooster</w:t>
+            </w:r>
+          </w:p>
+        </w:tc>
+        <w:tc>
+          <w:tcPr>
+            <w:tcW w:type="dxa" w:w="3685"/>
+          </w:tcPr>
+          <w:p>
+            <w:r/>
+            <w:r>
+              <w:rPr>
+                <w:sz w:val="20"/>
+              </w:rPr>
+              <w:t>onbebouwde kavel langs A27</w:t>
+            </w:r>
+          </w:p>
+        </w:tc>
+        <w:tc>
+          <w:tcPr>
+            <w:tcW w:type="dxa" w:w="1134"/>
+          </w:tcPr>
+          <w:p>
+            <w:r/>
+            <w:r>
+              <w:rPr>
+                <w:sz w:val="20"/>
+              </w:rPr>
+              <w:t>ind. 2 / kans</w:t>
+            </w:r>
+          </w:p>
+        </w:tc>
+      </w:tr>
+      <w:tr>
+        <w:tc>
+          <w:tcPr>
+            <w:tcW w:type="dxa" w:w="1814"/>
+          </w:tcPr>
+          <w:p>
+            <w:r/>
+            <w:r>
+              <w:rPr>
+                <w:sz w:val="20"/>
+              </w:rPr>
+              <w:t>'s-Hertogenbosch</w:t>
+            </w:r>
+          </w:p>
+        </w:tc>
+        <w:tc>
+          <w:tcPr>
+            <w:tcW w:type="dxa" w:w="2438"/>
+          </w:tcPr>
+          <w:p>
+            <w:r/>
+            <w:r>
+              <w:rPr>
+                <w:sz w:val="20"/>
+              </w:rPr>
+              <w:t>Voorgenomen verkoop drie percelen</w:t>
+            </w:r>
+          </w:p>
+        </w:tc>
+        <w:tc>
+          <w:tcPr>
+            <w:tcW w:type="dxa" w:w="3685"/>
+          </w:tcPr>
+          <w:p>
+            <w:r/>
+            <w:r>
+              <w:rPr>
+                <w:sz w:val="20"/>
+              </w:rPr>
+              <w:t>grondverwerving bedrijventerrein De Brand II</w:t>
+            </w:r>
+          </w:p>
+        </w:tc>
+        <w:tc>
+          <w:tcPr>
+            <w:tcW w:type="dxa" w:w="1134"/>
+          </w:tcPr>
+          <w:p>
+            <w:r/>
+            <w:r>
+              <w:rPr>
+                <w:sz w:val="20"/>
+              </w:rPr>
+              <w:t>ind. 2 / kans</w:t>
+            </w:r>
+          </w:p>
+        </w:tc>
+      </w:tr>
+      <w:tr>
+        <w:tc>
+          <w:tcPr>
+            <w:tcW w:type="dxa" w:w="1814"/>
+          </w:tcPr>
+          <w:p>
+            <w:r/>
+            <w:r>
+              <w:rPr>
+                <w:sz w:val="20"/>
+              </w:rPr>
+              <w:t>Dordrecht</w:t>
+            </w:r>
+          </w:p>
+        </w:tc>
+        <w:tc>
+          <w:tcPr>
+            <w:tcW w:type="dxa" w:w="2438"/>
+          </w:tcPr>
+          <w:p>
+            <w:r/>
+            <w:r>
+              <w:rPr>
+                <w:sz w:val="20"/>
+              </w:rPr>
+              <w:t>Voornemen tot uitgifte perceel</w:t>
+            </w:r>
+          </w:p>
+        </w:tc>
+        <w:tc>
+          <w:tcPr>
+            <w:tcW w:type="dxa" w:w="3685"/>
+          </w:tcPr>
+          <w:p>
+            <w:r/>
+            <w:r>
+              <w:rPr>
+                <w:sz w:val="20"/>
+              </w:rPr>
+              <w:t>Dordtse Kil beschikbaar voor bedrijvigheid</w:t>
+            </w:r>
+          </w:p>
+        </w:tc>
+        <w:tc>
+          <w:tcPr>
+            <w:tcW w:type="dxa" w:w="1134"/>
+          </w:tcPr>
+          <w:p>
+            <w:r/>
+            <w:r>
+              <w:rPr>
+                <w:sz w:val="20"/>
+              </w:rPr>
+              <w:t>ind. 2 / kans</w:t>
+            </w:r>
+          </w:p>
+        </w:tc>
+      </w:tr>
+      <w:tr>
+        <w:tc>
+          <w:tcPr>
+            <w:tcW w:type="dxa" w:w="1814"/>
+          </w:tcPr>
+          <w:p>
+            <w:r/>
+            <w:r>
+              <w:rPr>
+                <w:sz w:val="20"/>
+              </w:rPr>
+              <w:t>Breda</w:t>
+            </w:r>
+          </w:p>
+        </w:tc>
+        <w:tc>
+          <w:tcPr>
+            <w:tcW w:type="dxa" w:w="2438"/>
+          </w:tcPr>
+          <w:p>
+            <w:r/>
+            <w:r>
+              <w:rPr>
+                <w:sz w:val="20"/>
+              </w:rPr>
+              <w:t>Voornemen tot verkoop gedeelte perceel</w:t>
+            </w:r>
+          </w:p>
+        </w:tc>
+        <w:tc>
+          <w:tcPr>
+            <w:tcW w:type="dxa" w:w="3685"/>
+          </w:tcPr>
+          <w:p>
+            <w:r/>
+            <w:r>
+              <w:rPr>
+                <w:sz w:val="20"/>
+              </w:rPr>
+              <w:t>deel kavel naar ambulancepost i.p.v. industrie</w:t>
+            </w:r>
+          </w:p>
+        </w:tc>
+        <w:tc>
+          <w:tcPr>
+            <w:tcW w:type="dxa" w:w="1134"/>
+          </w:tcPr>
+          <w:p>
+            <w:r/>
+            <w:r>
+              <w:rPr>
+                <w:sz w:val="20"/>
+              </w:rPr>
+              <w:t>ind. 2 / risico</w:t>
+            </w:r>
+          </w:p>
+        </w:tc>
+      </w:tr>
+      <w:tr>
+        <w:tc>
+          <w:tcPr>
+            <w:tcW w:type="dxa" w:w="1814"/>
+          </w:tcPr>
+          <w:p>
+            <w:r/>
+            <w:r>
+              <w:rPr>
+                <w:sz w:val="20"/>
+              </w:rPr>
+              <w:t>Zoetermeer</w:t>
+            </w:r>
+          </w:p>
+        </w:tc>
+        <w:tc>
+          <w:tcPr>
+            <w:tcW w:type="dxa" w:w="2438"/>
+          </w:tcPr>
+          <w:p>
+            <w:r/>
+            <w:r>
+              <w:rPr>
+                <w:sz w:val="20"/>
+              </w:rPr>
+              <w:t>Voornemen grondverkoop Oostweg 2</w:t>
+            </w:r>
+          </w:p>
+        </w:tc>
+        <w:tc>
+          <w:tcPr>
+            <w:tcW w:type="dxa" w:w="3685"/>
+          </w:tcPr>
+          <w:p>
+            <w:r/>
+            <w:r>
+              <w:rPr>
+                <w:sz w:val="20"/>
+              </w:rPr>
+              <w:t>herontwikkeling naar gemengd gebruik</w:t>
+            </w:r>
+          </w:p>
+        </w:tc>
+        <w:tc>
+          <w:tcPr>
+            <w:tcW w:type="dxa" w:w="1134"/>
+          </w:tcPr>
+          <w:p>
+            <w:r/>
+            <w:r>
+              <w:rPr>
+                <w:sz w:val="20"/>
+              </w:rPr>
+              <w:t>ind. 2 / context</w:t>
+            </w:r>
+          </w:p>
+        </w:tc>
+      </w:tr>
+    </w:tbl>
+    <w:p>
+      <w:r>
+        <w:t>Hetzelfde documenttype krijgt een inhoudsgedreven oordeel: Breda wordt als enige risico omdat de grond naar een niet-industriele functie gaat. Geen gemeente-bias.</w:t>
+      </w:r>
+    </w:p>
+    <w:p>
+      <w:r>
+        <w:t>Tegenproef — waar bedrijventerrein verdwijnt of krimpt, komt consistent risico uit:</w:t>
+      </w:r>
+    </w:p>
+    <w:tbl>
+      <w:tblPr>
+        <w:tblStyle w:val="TableGrid"/>
+        <w:tblW w:type="auto" w:w="0"/>
+        <w:tblLook w:firstColumn="1" w:firstRow="1" w:lastColumn="0" w:lastRow="0" w:noHBand="0" w:noVBand="1" w:val="04A0"/>
+      </w:tblPr>
+      <w:tblGrid>
+        <w:gridCol w:w="2268"/>
+        <w:gridCol w:w="2268"/>
+        <w:gridCol w:w="2268"/>
+        <w:gridCol w:w="2268"/>
+      </w:tblGrid>
+      <w:tr>
+        <w:tc>
+          <w:tcPr>
+            <w:tcW w:type="dxa" w:w="1814"/>
+            <w:shd w:val="clear" w:fill="DDDDDD"/>
+          </w:tcPr>
+          <w:p>
+            <w:r/>
+            <w:r>
+              <w:rPr>
+                <w:b/>
+                <w:sz w:val="20"/>
+              </w:rPr>
+              <w:t>Gemeente</w:t>
+            </w:r>
+          </w:p>
+        </w:tc>
+        <w:tc>
+          <w:tcPr>
+            <w:tcW w:type="dxa" w:w="2438"/>
+            <w:shd w:val="clear" w:fill="DDDDDD"/>
+          </w:tcPr>
+          <w:p>
+            <w:r/>
+            <w:r>
+              <w:rPr>
+                <w:b/>
+                <w:sz w:val="20"/>
+              </w:rPr>
+              <w:t>Document</w:t>
+            </w:r>
+          </w:p>
+        </w:tc>
+        <w:tc>
+          <w:tcPr>
+            <w:tcW w:type="dxa" w:w="3685"/>
+            <w:shd w:val="clear" w:fill="DDDDDD"/>
+          </w:tcPr>
+          <w:p>
+            <w:r/>
+            <w:r>
+              <w:rPr>
+                <w:b/>
+                <w:sz w:val="20"/>
+              </w:rPr>
+              <w:t>Inhoud</w:t>
+            </w:r>
+          </w:p>
+        </w:tc>
+        <w:tc>
+          <w:tcPr>
+            <w:tcW w:type="dxa" w:w="1134"/>
+            <w:shd w:val="clear" w:fill="DDDDDD"/>
+          </w:tcPr>
+          <w:p>
+            <w:r/>
+            <w:r>
+              <w:rPr>
+                <w:b/>
+                <w:sz w:val="20"/>
+              </w:rPr>
+              <w:t>Oordeel</w:t>
+            </w:r>
+          </w:p>
+        </w:tc>
+      </w:tr>
+      <w:tr>
+        <w:tc>
+          <w:tcPr>
+            <w:tcW w:type="dxa" w:w="1814"/>
+          </w:tcPr>
+          <w:p>
+            <w:r/>
+            <w:r>
+              <w:rPr>
+                <w:sz w:val="20"/>
+              </w:rPr>
+              <w:t>Breda</w:t>
+            </w:r>
+          </w:p>
+        </w:tc>
+        <w:tc>
+          <w:tcPr>
+            <w:tcW w:type="dxa" w:w="2438"/>
+          </w:tcPr>
+          <w:p>
+            <w:r/>
+            <w:r>
+              <w:rPr>
+                <w:sz w:val="20"/>
+              </w:rPr>
+              <w:t>Radenbijeenkomst Baronie Bedrijventerreinen</w:t>
+            </w:r>
+          </w:p>
+        </w:tc>
+        <w:tc>
+          <w:tcPr>
+            <w:tcW w:type="dxa" w:w="3685"/>
+          </w:tcPr>
+          <w:p>
+            <w:r/>
+            <w:r>
+              <w:rPr>
+                <w:sz w:val="20"/>
+              </w:rPr>
+              <w:t>bedrijventerrein omzetten naar detailhandel verkleint aanbod</w:t>
+            </w:r>
+          </w:p>
+        </w:tc>
+        <w:tc>
+          <w:tcPr>
+            <w:tcW w:type="dxa" w:w="1134"/>
+          </w:tcPr>
+          <w:p>
+            <w:r/>
+            <w:r>
+              <w:rPr>
+                <w:sz w:val="20"/>
+              </w:rPr>
+              <w:t>ind. 2 / risico</w:t>
+            </w:r>
+          </w:p>
+        </w:tc>
+      </w:tr>
+      <w:tr>
+        <w:tc>
+          <w:tcPr>
+            <w:tcW w:type="dxa" w:w="1814"/>
+          </w:tcPr>
+          <w:p>
+            <w:r/>
+            <w:r>
+              <w:rPr>
+                <w:sz w:val="20"/>
+              </w:rPr>
+              <w:t>Den Haag</w:t>
+            </w:r>
+          </w:p>
+        </w:tc>
+        <w:tc>
+          <w:tcPr>
+            <w:tcW w:type="dxa" w:w="2438"/>
+          </w:tcPr>
+          <w:p>
+            <w:r/>
+            <w:r>
+              <w:rPr>
+                <w:sz w:val="20"/>
+              </w:rPr>
+              <w:t>RIS325198 Functie-indeling/vlekkenplan</w:t>
+            </w:r>
+          </w:p>
+        </w:tc>
+        <w:tc>
+          <w:tcPr>
+            <w:tcW w:type="dxa" w:w="3685"/>
+          </w:tcPr>
+          <w:p>
+            <w:r/>
+            <w:r>
+              <w:rPr>
+                <w:sz w:val="20"/>
+              </w:rPr>
+              <w:t>grootschalige afvalvestiging op meerdere werkkavels</w:t>
+            </w:r>
+          </w:p>
+        </w:tc>
+        <w:tc>
+          <w:tcPr>
+            <w:tcW w:type="dxa" w:w="1134"/>
+          </w:tcPr>
+          <w:p>
+            <w:r/>
+            <w:r>
+              <w:rPr>
+                <w:sz w:val="20"/>
+              </w:rPr>
+              <w:t>ind. 2 / risico</w:t>
+            </w:r>
+          </w:p>
+        </w:tc>
+      </w:tr>
+      <w:tr>
+        <w:tc>
+          <w:tcPr>
+            <w:tcW w:type="dxa" w:w="1814"/>
+          </w:tcPr>
+          <w:p>
+            <w:r/>
+            <w:r>
+              <w:rPr>
+                <w:sz w:val="20"/>
+              </w:rPr>
+              <w:t>Eindhoven</w:t>
+            </w:r>
+          </w:p>
+        </w:tc>
+        <w:tc>
+          <w:tcPr>
+            <w:tcW w:type="dxa" w:w="2438"/>
+          </w:tcPr>
+          <w:p>
+            <w:r/>
+            <w:r>
+              <w:rPr>
+                <w:sz w:val="20"/>
+              </w:rPr>
+              <w:t>Raadsvoorstel Wonen op Park Forum Zuid</w:t>
+            </w:r>
+          </w:p>
+        </w:tc>
+        <w:tc>
+          <w:tcPr>
+            <w:tcW w:type="dxa" w:w="3685"/>
+          </w:tcPr>
+          <w:p>
+            <w:r/>
+            <w:r>
+              <w:rPr>
+                <w:sz w:val="20"/>
+              </w:rPr>
+              <w:t>transformatie naar wonen; vervalt als bedrijventerrein</w:t>
+            </w:r>
+          </w:p>
+        </w:tc>
+        <w:tc>
+          <w:tcPr>
+            <w:tcW w:type="dxa" w:w="1134"/>
+          </w:tcPr>
+          <w:p>
+            <w:r/>
+            <w:r>
+              <w:rPr>
+                <w:sz w:val="20"/>
+              </w:rPr>
+              <w:t>ind. 2 / risico</w:t>
+            </w:r>
+          </w:p>
+        </w:tc>
+      </w:tr>
+      <w:tr>
+        <w:tc>
+          <w:tcPr>
+            <w:tcW w:type="dxa" w:w="1814"/>
+          </w:tcPr>
+          <w:p>
+            <w:r/>
+            <w:r>
+              <w:rPr>
+                <w:sz w:val="20"/>
+              </w:rPr>
+              <w:t>Gouda</w:t>
+            </w:r>
+          </w:p>
+        </w:tc>
+        <w:tc>
+          <w:tcPr>
+            <w:tcW w:type="dxa" w:w="2438"/>
+          </w:tcPr>
+          <w:p>
+            <w:r/>
+            <w:r>
+              <w:rPr>
+                <w:sz w:val="20"/>
+              </w:rPr>
+              <w:t>Nota Grondbeleid</w:t>
+            </w:r>
+          </w:p>
+        </w:tc>
+        <w:tc>
+          <w:tcPr>
+            <w:tcW w:type="dxa" w:w="3685"/>
+          </w:tcPr>
+          <w:p>
+            <w:r/>
+            <w:r>
+              <w:rPr>
+                <w:sz w:val="20"/>
+              </w:rPr>
+              <w:t>teruglopende grondposities door transformatie en uitgifte</w:t>
+            </w:r>
+          </w:p>
+        </w:tc>
+        <w:tc>
+          <w:tcPr>
+            <w:tcW w:type="dxa" w:w="1134"/>
+          </w:tcPr>
+          <w:p>
+            <w:r/>
+            <w:r>
+              <w:rPr>
+                <w:sz w:val="20"/>
+              </w:rPr>
+              <w:t>ind. 2 / risico</w:t>
+            </w:r>
+          </w:p>
+        </w:tc>
+      </w:tr>
+    </w:tbl>
+    <w:p>
+      <w:r>
+        <w:t>Indicatorherkenning: alle tien indicatoren komen in alle gemeenten voor (ook buiten de casus), en de verdeling weerspiegelt het gemeenteprofiel (Zoetermeer en Eindhoven hoog op indicator 2; Utrecht hoog op indicator 1 en 10). De regels werken dus generiek, niet overfit op de drie casusgemeenten. Nuance: het verband netcongestie -&gt; indicator 4 is hard aantoonbaar; het verband transformatie -&gt; indicator 1 is op trefwoord gematcht en daarom zachter.</w:t>
+      </w:r>
+    </w:p>
+    <w:p>
+      <w:r>
+        <w:t>Beslisregeltoepassing: de tool hanteert een uniform indicatorenkader voor elke gemeente; er is geen ingebouwd gemeenteprofiel. De gemeentecontext komt uitsluitend binnen via de documenttekst. Dat de uitkomst toch het gemeenteprofiel weerspiegelt, is een emergent, inhoudsgedreven effect.</w:t>
+      </w:r>
+    </w:p>
+    <w:p>
+      <w:r>
+        <w:rPr>
+          <w:b/>
+        </w:rPr>
+        <w:t xml:space="preserve">Kanttekening (zelfreferentie). </w:t>
+      </w:r>
+      <w:r>
+        <w:t>Deze toets vergelijkt de tool met het eigen kader en bewijst daarom alleen interne consistentie en generieke toepassing, niet dat de classificaties de werkelijkheid correct weergeven. De externe validiteit komt uit de validatiegesprekken (deelvraag 4).</w:t>
+      </w:r>
+    </w:p>
+    <w:p>
+      <w:pPr>
+        <w:pStyle w:val="Heading2"/>
+      </w:pPr>
+      <w:r>
+        <w:rPr>
+          <w:color w:val="000000"/>
+        </w:rPr>
+        <w:t>9.2 Zelf-gecodeerde steekproef (accuratesse)</w:t>
+      </w:r>
+    </w:p>
+    <w:p>
+      <w:r>
+        <w:t>Doel: de accuratesse benaderen door de tool-output onafhankelijk te vergelijken met het vakinhoudelijke oordeel van de onderzoeker.</w:t>
+      </w:r>
+    </w:p>
+    <w:p>
+      <w:pPr>
+        <w:pStyle w:val="ListBullet"/>
+      </w:pPr>
+      <w:r>
+        <w:rPr>
+          <w:b/>
+        </w:rPr>
+        <w:t xml:space="preserve">Steekproef — </w:t>
+      </w:r>
+      <w:r>
+        <w:t>30 signalen aselect getrokken uit de volledige set (circa 6.000), gespreid over de gemeenten; vastgelegd in een codeerbestand.</w:t>
+      </w:r>
+    </w:p>
+    <w:p>
+      <w:pPr>
+        <w:pStyle w:val="ListBullet"/>
+      </w:pPr>
+      <w:r>
+        <w:rPr>
+          <w:b/>
+        </w:rPr>
+        <w:t xml:space="preserve">Eenheid — </w:t>
+      </w:r>
+      <w:r>
+        <w:t>het individuele signaal (document x indicator), met titel, samenvatting, onderbouwing en citaat.</w:t>
+      </w:r>
+    </w:p>
+    <w:p>
+      <w:pPr>
+        <w:pStyle w:val="ListBullet"/>
+      </w:pPr>
+      <w:r>
+        <w:rPr>
+          <w:b/>
+        </w:rPr>
+        <w:t xml:space="preserve">Criteria — </w:t>
+      </w:r>
+      <w:r>
+        <w:t>per signaal: (1) is de indicator juist, (2) is de classificatie juist (kans/risico/contextafhankelijk/niet-relevant), (3) is de relevantie passend.</w:t>
+      </w:r>
+    </w:p>
+    <w:p>
+      <w:pPr>
+        <w:pStyle w:val="ListBullet"/>
+      </w:pPr>
+      <w:r>
+        <w:rPr>
+          <w:b/>
+        </w:rPr>
+        <w:t xml:space="preserve">Procedure — </w:t>
+      </w:r>
+      <w:r>
+        <w:t>semi-blind: de onderzoeker noteert eerst het eigen oordeel en bekijkt daarna pas het oordeel van de tool.</w:t>
+      </w:r>
+    </w:p>
+    <w:p>
+      <w:pPr>
+        <w:pStyle w:val="ListBullet"/>
+      </w:pPr>
+      <w:r>
+        <w:rPr>
+          <w:b/>
+        </w:rPr>
+        <w:t xml:space="preserve">Maten — </w:t>
+      </w:r>
+      <w:r>
+        <w:t>percentage overeenstemming indicator, percentage overeenstemming classificatie, gemiddelde relevantie-afwijking, plus kwalitatieve analyse van de afwijkingen.</w:t>
+      </w:r>
+    </w:p>
+    <w:p>
+      <w:pPr>
+        <w:pStyle w:val="ListBullet"/>
+      </w:pPr>
+      <w:r>
+        <w:rPr>
+          <w:b/>
+        </w:rPr>
+        <w:t xml:space="preserve">Beperkingen — </w:t>
+      </w:r>
+      <w:r>
+        <w:t>kleine n (indicatief); een beoordelaar (geen inter-beoordelaarsbetrouwbaarheid); beoordeling op samenvatting i.p.v. volledige brontekst; en deels zelfreferentieel (onderzoeker en tool gebruiken hetzelfde kader).</w:t>
+      </w:r>
+    </w:p>
+    <w:p>
+      <w:r>
+        <w:t>Resultaat (n=25 gecodeerde signalen). Berekening:</w:t>
+      </w:r>
+    </w:p>
+    <w:p>
+      <w:pPr>
+        <w:pStyle w:val="ListBullet"/>
+      </w:pPr>
+      <w:r>
+        <w:rPr>
+          <w:b/>
+        </w:rPr>
+        <w:t xml:space="preserve">Indicator-overeenstemming — </w:t>
+      </w:r>
+      <w:r>
+        <w:t>aantal 'indicator juist' / totaal = 23 / 25 = 92%.</w:t>
+      </w:r>
+    </w:p>
+    <w:p>
+      <w:pPr>
+        <w:pStyle w:val="ListBullet"/>
+      </w:pPr>
+      <w:r>
+        <w:rPr>
+          <w:b/>
+        </w:rPr>
+        <w:t xml:space="preserve">Classificatie-overeenstemming — </w:t>
+      </w:r>
+      <w:r>
+        <w:t>aantal signalen met gelijke classificatie / totaal = 19 / 25 = 76%.</w:t>
+      </w:r>
+    </w:p>
+    <w:p>
+      <w:pPr>
+        <w:pStyle w:val="ListBullet"/>
+      </w:pPr>
+      <w:r>
+        <w:rPr>
+          <w:b/>
+        </w:rPr>
+        <w:t xml:space="preserve">Relevantie-afwijking — </w:t>
+      </w:r>
+      <w:r>
+        <w:t>gemiddelde van |relevantie onderzoeker - relevantie tool| = som 27 / 25 = circa 1,1 punt.</w:t>
+      </w:r>
+    </w:p>
+    <w:p>
+      <w:r>
+        <w:t>De zes afwijkingen waren systematisch, geen willekeur:</w:t>
+      </w:r>
+    </w:p>
+    <w:tbl>
+      <w:tblPr>
+        <w:tblStyle w:val="TableGrid"/>
+        <w:tblW w:type="auto" w:w="0"/>
+        <w:tblLook w:firstColumn="1" w:firstRow="1" w:lastColumn="0" w:lastRow="0" w:noHBand="0" w:noVBand="1" w:val="04A0"/>
+      </w:tblPr>
+      <w:tblGrid>
+        <w:gridCol w:w="2268"/>
+        <w:gridCol w:w="2268"/>
+        <w:gridCol w:w="2268"/>
+        <w:gridCol w:w="2268"/>
+      </w:tblGrid>
+      <w:tr>
+        <w:tc>
+          <w:tcPr>
+            <w:tcW w:type="dxa" w:w="3685"/>
+            <w:shd w:val="clear" w:fill="DDDDDD"/>
+          </w:tcPr>
+          <w:p>
+            <w:r/>
+            <w:r>
+              <w:rPr>
+                <w:b/>
+                <w:sz w:val="20"/>
+              </w:rPr>
+              <w:t>Document</w:t>
+            </w:r>
+          </w:p>
+        </w:tc>
+        <w:tc>
+          <w:tcPr>
+            <w:tcW w:type="dxa" w:w="1417"/>
+            <w:shd w:val="clear" w:fill="DDDDDD"/>
+          </w:tcPr>
+          <w:p>
+            <w:r/>
+            <w:r>
+              <w:rPr>
+                <w:b/>
+                <w:sz w:val="20"/>
+              </w:rPr>
+              <w:t>Tool</w:t>
+            </w:r>
+          </w:p>
+        </w:tc>
+        <w:tc>
+          <w:tcPr>
+            <w:tcW w:type="dxa" w:w="1701"/>
+            <w:shd w:val="clear" w:fill="DDDDDD"/>
+          </w:tcPr>
+          <w:p>
+            <w:r/>
+            <w:r>
+              <w:rPr>
+                <w:b/>
+                <w:sz w:val="20"/>
+              </w:rPr>
+              <w:t>Onderzoeker</w:t>
+            </w:r>
+          </w:p>
+        </w:tc>
+        <w:tc>
+          <w:tcPr>
+            <w:tcW w:type="dxa" w:w="2268"/>
+            <w:shd w:val="clear" w:fill="DDDDDD"/>
+          </w:tcPr>
+          <w:p>
+            <w:r/>
+            <w:r>
+              <w:rPr>
+                <w:b/>
+                <w:sz w:val="20"/>
+              </w:rPr>
+              <w:t>Type afwijking</w:t>
+            </w:r>
+          </w:p>
+        </w:tc>
+      </w:tr>
+      <w:tr>
+        <w:tc>
+          <w:tcPr>
+            <w:tcW w:type="dxa" w:w="3685"/>
+          </w:tcPr>
+          <w:p>
+            <w:r/>
+            <w:r>
+              <w:rPr>
+                <w:sz w:val="20"/>
+              </w:rPr>
+              <w:t>Helmond - verkoop perceel (al verkocht)</w:t>
+            </w:r>
+          </w:p>
+        </w:tc>
+        <w:tc>
+          <w:tcPr>
+            <w:tcW w:type="dxa" w:w="1417"/>
+          </w:tcPr>
+          <w:p>
+            <w:r/>
+            <w:r>
+              <w:rPr>
+                <w:sz w:val="20"/>
+              </w:rPr>
+              <w:t>kans (5)</w:t>
+            </w:r>
+          </w:p>
+        </w:tc>
+        <w:tc>
+          <w:tcPr>
+            <w:tcW w:type="dxa" w:w="1701"/>
+          </w:tcPr>
+          <w:p>
+            <w:r/>
+            <w:r>
+              <w:rPr>
+                <w:sz w:val="20"/>
+              </w:rPr>
+              <w:t>niet-relevant</w:t>
+            </w:r>
+          </w:p>
+        </w:tc>
+        <w:tc>
+          <w:tcPr>
+            <w:tcW w:type="dxa" w:w="2268"/>
+          </w:tcPr>
+          <w:p>
+            <w:r/>
+            <w:r>
+              <w:rPr>
+                <w:sz w:val="20"/>
+              </w:rPr>
+              <w:t>vals positief / ruis</w:t>
+            </w:r>
+          </w:p>
+        </w:tc>
+      </w:tr>
+      <w:tr>
+        <w:tc>
+          <w:tcPr>
+            <w:tcW w:type="dxa" w:w="3685"/>
+          </w:tcPr>
+          <w:p>
+            <w:r/>
+            <w:r>
+              <w:rPr>
+                <w:sz w:val="20"/>
+              </w:rPr>
+              <w:t>Gouda - vergunning ander bedrijfsverzamelgebouw</w:t>
+            </w:r>
+          </w:p>
+        </w:tc>
+        <w:tc>
+          <w:tcPr>
+            <w:tcW w:type="dxa" w:w="1417"/>
+          </w:tcPr>
+          <w:p>
+            <w:r/>
+            <w:r>
+              <w:rPr>
+                <w:sz w:val="20"/>
+              </w:rPr>
+              <w:t>kans (5)</w:t>
+            </w:r>
+          </w:p>
+        </w:tc>
+        <w:tc>
+          <w:tcPr>
+            <w:tcW w:type="dxa" w:w="1701"/>
+          </w:tcPr>
+          <w:p>
+            <w:r/>
+            <w:r>
+              <w:rPr>
+                <w:sz w:val="20"/>
+              </w:rPr>
+              <w:t>niet-relevant</w:t>
+            </w:r>
+          </w:p>
+        </w:tc>
+        <w:tc>
+          <w:tcPr>
+            <w:tcW w:type="dxa" w:w="2268"/>
+          </w:tcPr>
+          <w:p>
+            <w:r/>
+            <w:r>
+              <w:rPr>
+                <w:sz w:val="20"/>
+              </w:rPr>
+              <w:t>vals positief (+ indicator)</w:t>
+            </w:r>
+          </w:p>
+        </w:tc>
+      </w:tr>
+      <w:tr>
+        <w:tc>
+          <w:tcPr>
+            <w:tcW w:type="dxa" w:w="3685"/>
+          </w:tcPr>
+          <w:p>
+            <w:r/>
+            <w:r>
+              <w:rPr>
+                <w:sz w:val="20"/>
+              </w:rPr>
+              <w:t>Gouda - Handboek Grondzaken</w:t>
+            </w:r>
+          </w:p>
+        </w:tc>
+        <w:tc>
+          <w:tcPr>
+            <w:tcW w:type="dxa" w:w="1417"/>
+          </w:tcPr>
+          <w:p>
+            <w:r/>
+            <w:r>
+              <w:rPr>
+                <w:sz w:val="20"/>
+              </w:rPr>
+              <w:t>kans (4)</w:t>
+            </w:r>
+          </w:p>
+        </w:tc>
+        <w:tc>
+          <w:tcPr>
+            <w:tcW w:type="dxa" w:w="1701"/>
+          </w:tcPr>
+          <w:p>
+            <w:r/>
+            <w:r>
+              <w:rPr>
+                <w:sz w:val="20"/>
+              </w:rPr>
+              <w:t>niet-relevant</w:t>
+            </w:r>
+          </w:p>
+        </w:tc>
+        <w:tc>
+          <w:tcPr>
+            <w:tcW w:type="dxa" w:w="2268"/>
+          </w:tcPr>
+          <w:p>
+            <w:r/>
+            <w:r>
+              <w:rPr>
+                <w:sz w:val="20"/>
+              </w:rPr>
+              <w:t>vals positief / ruis</w:t>
+            </w:r>
+          </w:p>
+        </w:tc>
+      </w:tr>
+      <w:tr>
+        <w:tc>
+          <w:tcPr>
+            <w:tcW w:type="dxa" w:w="3685"/>
+          </w:tcPr>
+          <w:p>
+            <w:r/>
+            <w:r>
+              <w:rPr>
+                <w:sz w:val="20"/>
+              </w:rPr>
+              <w:t>Gouda - brief Federatie Ruimtelijke Kwaliteit</w:t>
+            </w:r>
+          </w:p>
+        </w:tc>
+        <w:tc>
+          <w:tcPr>
+            <w:tcW w:type="dxa" w:w="1417"/>
+          </w:tcPr>
+          <w:p>
+            <w:r/>
+            <w:r>
+              <w:rPr>
+                <w:sz w:val="20"/>
+              </w:rPr>
+              <w:t>context (2)</w:t>
+            </w:r>
+          </w:p>
+        </w:tc>
+        <w:tc>
+          <w:tcPr>
+            <w:tcW w:type="dxa" w:w="1701"/>
+          </w:tcPr>
+          <w:p>
+            <w:r/>
+            <w:r>
+              <w:rPr>
+                <w:sz w:val="20"/>
+              </w:rPr>
+              <w:t>niet-relevant</w:t>
+            </w:r>
+          </w:p>
+        </w:tc>
+        <w:tc>
+          <w:tcPr>
+            <w:tcW w:type="dxa" w:w="2268"/>
+          </w:tcPr>
+          <w:p>
+            <w:r/>
+            <w:r>
+              <w:rPr>
+                <w:sz w:val="20"/>
+              </w:rPr>
+              <w:t>vals positief (+ indicator)</w:t>
+            </w:r>
+          </w:p>
+        </w:tc>
+      </w:tr>
+      <w:tr>
+        <w:tc>
+          <w:tcPr>
+            <w:tcW w:type="dxa" w:w="3685"/>
+          </w:tcPr>
+          <w:p>
+            <w:r/>
+            <w:r>
+              <w:rPr>
+                <w:sz w:val="20"/>
+              </w:rPr>
+              <w:t>Zoetermeer - strategische aankoop grond</w:t>
+            </w:r>
+          </w:p>
+        </w:tc>
+        <w:tc>
+          <w:tcPr>
+            <w:tcW w:type="dxa" w:w="1417"/>
+          </w:tcPr>
+          <w:p>
+            <w:r/>
+            <w:r>
+              <w:rPr>
+                <w:sz w:val="20"/>
+              </w:rPr>
+              <w:t>kans (5)</w:t>
+            </w:r>
+          </w:p>
+        </w:tc>
+        <w:tc>
+          <w:tcPr>
+            <w:tcW w:type="dxa" w:w="1701"/>
+          </w:tcPr>
+          <w:p>
+            <w:r/>
+            <w:r>
+              <w:rPr>
+                <w:sz w:val="20"/>
+              </w:rPr>
+              <w:t>risico (5)</w:t>
+            </w:r>
+          </w:p>
+        </w:tc>
+        <w:tc>
+          <w:tcPr>
+            <w:tcW w:type="dxa" w:w="2268"/>
+          </w:tcPr>
+          <w:p>
+            <w:r/>
+            <w:r>
+              <w:rPr>
+                <w:sz w:val="20"/>
+              </w:rPr>
+              <w:t>polariteitsfout</w:t>
+            </w:r>
+          </w:p>
+        </w:tc>
+      </w:tr>
+      <w:tr>
+        <w:tc>
+          <w:tcPr>
+            <w:tcW w:type="dxa" w:w="3685"/>
+          </w:tcPr>
+          <w:p>
+            <w:r/>
+            <w:r>
+              <w:rPr>
+                <w:sz w:val="20"/>
+              </w:rPr>
+              <w:t>Oss - Spooragenda 2025-2040</w:t>
+            </w:r>
+          </w:p>
+        </w:tc>
+        <w:tc>
+          <w:tcPr>
+            <w:tcW w:type="dxa" w:w="1417"/>
+          </w:tcPr>
+          <w:p>
+            <w:r/>
+            <w:r>
+              <w:rPr>
+                <w:sz w:val="20"/>
+              </w:rPr>
+              <w:t>context</w:t>
+            </w:r>
+          </w:p>
+        </w:tc>
+        <w:tc>
+          <w:tcPr>
+            <w:tcW w:type="dxa" w:w="1701"/>
+          </w:tcPr>
+          <w:p>
+            <w:r/>
+            <w:r>
+              <w:rPr>
+                <w:sz w:val="20"/>
+              </w:rPr>
+              <w:t>kans</w:t>
+            </w:r>
+          </w:p>
+        </w:tc>
+        <w:tc>
+          <w:tcPr>
+            <w:tcW w:type="dxa" w:w="2268"/>
+          </w:tcPr>
+          <w:p>
+            <w:r/>
+            <w:r>
+              <w:rPr>
+                <w:sz w:val="20"/>
+              </w:rPr>
+              <w:t>kans/context-nuance</w:t>
+            </w:r>
+          </w:p>
+        </w:tc>
+      </w:tr>
+    </w:tbl>
+    <w:p>
+      <w:r>
+        <w:t>Interpretatie: de afwijkingen zijn overwegend valse positieven - de tool labelt enkele generieke of niet-relevante stukken als 'kans' met een te hoge relevantie - plus een polariteitsfout (een gemeente die zelf grond verwerft is voor een ontwikkelaar een risico, niet een kans). Een strengere relevantiedrempel zou het merendeel van deze afwijkingen wegnemen. De fouten zijn systematisch en verklaarbaar, niet willekeurig.</w:t>
+      </w:r>
+    </w:p>
+    <w:p>
+      <w:pPr>
+        <w:pStyle w:val="Heading1"/>
+      </w:pPr>
+      <w:r>
+        <w:rPr>
+          <w:color w:val="000000"/>
+        </w:rPr>
+        <w:t>10. Verantwoording gebruik generatieve AI</w:t>
       </w:r>
     </w:p>
     <w:p>
@@ -1546,7 +3373,7 @@
         <w:t>Claude Code</w:t>
       </w:r>
       <w:r>
-        <w:t xml:space="preserve"> (Anthropic, 2026), een generatieve-AI-assistent voor softwareontwikkeling (aangedreven door het model Claude Opus 4.8). De classificatie binnen de applicatie gebruikt het model Claude Sonnet 4.6.</w:t>
+        <w:t xml:space="preserve"> (Anthropic, 2026), een generatieve-AI-assistent voor softwareontwikkeling (aangedreven door het model Claude Opus 4.8). De classificatie binnen de applicatie gebruikt het lichtere, kostenefficiente model Claude Haiku 4.5.</w:t>
       </w:r>
     </w:p>
     <w:p>
@@ -1579,7 +3406,7 @@
         <w:rPr>
           <w:color w:val="000000"/>
         </w:rPr>
-        <w:t>10. Reproductie (kort)</w:t>
+        <w:t>11. Reproductie (kort)</w:t>
       </w:r>
     </w:p>
     <w:p>

</xml_diff>